<commit_message>
Revise quiz per reviewer comments + remove longest-answer tell
Acted on the doc comments (Q3, Q22, Q23, Q25, Q26, Q27) and fixed a
systemic giveaway: the correct answer was the longest option in 15 of 22
MCQs. Rebalanced option lengths so the correct answer is never the unique
longest (now 0 of 22), without changing any correct answer.

- Q3, Q22, Q27: stronger, more plausible distractors.
- Q23: stem broadened to "another characteristic cardiac manifestation."
- Q25/Q26: removed the giveaway parentheticals "(vertebrobasilar)" and
  "(hypohidrosis)" from the correct options.
- All 22 MCQs: option lengths tightened into a narrow band.

Applied to the live quiz_questions table via the admin API; source
defaults, the CSV/markdown exports, and the Word answer-key regenerated
to match. No correct-answer positions changed (distribution still
A=6/B=5/C=5/D=6).

Co-Authored-By: Claude Opus 4.7 <noreply@anthropic.com>
</commit_message>
<xml_diff>
--- a/docs/Fabry-Quiz-Questions-AnswerKey.docx
+++ b/docs/Fabry-Quiz-Questions-AnswerKey.docx
@@ -326,7 +326,7 @@
           <w:b w:val="false"/>
           <w:bCs w:val="false"/>
         </w:rPr>
-        <w:t xml:space="preserve">An unrelated comorbidity that should be managed independently</w:t>
+        <w:t xml:space="preserve">A coincidental functional bowel disorder unrelated to the underlying disease</w:t>
       </w:r>
     </w:p>
     <w:p>
@@ -346,7 +346,7 @@
           <w:b w:val="false"/>
           <w:bCs w:val="false"/>
         </w:rPr>
-        <w:t xml:space="preserve">A side effect of long-term gabapentin therapy</w:t>
+        <w:t xml:space="preserve">An adverse effect of the chronic neuropathic-pain medications he takes</w:t>
       </w:r>
     </w:p>
     <w:p>
@@ -366,7 +366,7 @@
           <w:b/>
           <w:bCs/>
         </w:rPr>
-        <w:t xml:space="preserve">A direct manifestation of the underlying disease, often delaying its diagnosis</w:t>
+        <w:t xml:space="preserve">A direct gastrointestinal manifestation of the disease, often predating its diagnosis</w:t>
       </w:r>
       <w:r>
         <w:rPr>
@@ -394,7 +394,7 @@
           <w:b w:val="false"/>
           <w:bCs w:val="false"/>
         </w:rPr>
-        <w:t xml:space="preserve">An indication for empiric antibiotic therapy for small-intestinal bacterial overgrowth</w:t>
+        <w:t xml:space="preserve">A sign of mesenteric ischemia from vascular involvement, warranting urgent mesenteric angiography</w:t>
       </w:r>
     </w:p>
     <w:p>
@@ -438,7 +438,7 @@
           <w:b w:val="false"/>
           <w:bCs w:val="false"/>
         </w:rPr>
-        <w:t xml:space="preserve">Erythematous, scaly plaques on the extensor surfaces of the elbows and knees</w:t>
+        <w:t xml:space="preserve">Erythematous, silvery-scaled plaques on the extensor surfaces of the elbows and knees</w:t>
       </w:r>
     </w:p>
     <w:p>
@@ -458,7 +458,7 @@
           <w:b/>
           <w:bCs/>
         </w:rPr>
-        <w:t xml:space="preserve">Clusters of small, dark-red papules on the lower abdomen, groin, and upper thighs</w:t>
+        <w:t xml:space="preserve">Clusters of small, dark-red papules over the lower abdomen, groin, and upper thighs</w:t>
       </w:r>
       <w:r>
         <w:rPr>
@@ -486,7 +486,7 @@
           <w:b w:val="false"/>
           <w:bCs w:val="false"/>
         </w:rPr>
-        <w:t xml:space="preserve">Hyperpigmented velvety patches in the axillae and posterior neck</w:t>
+        <w:t xml:space="preserve">Hyperpigmented, velvety thickened patches in the axillae and the posterior neck folds</w:t>
       </w:r>
     </w:p>
     <w:p>
@@ -506,7 +506,7 @@
           <w:b w:val="false"/>
           <w:bCs w:val="false"/>
         </w:rPr>
-        <w:t xml:space="preserve">Yellow nodules along the Achilles and extensor tendons of the hands</w:t>
+        <w:t xml:space="preserve">Firm yellow-orange nodules overlying the Achilles and the extensor tendons of the hands</w:t>
       </w:r>
     </w:p>
     <w:p>
@@ -550,7 +550,7 @@
           <w:b w:val="false"/>
           <w:bCs w:val="false"/>
         </w:rPr>
-        <w:t xml:space="preserve">It is pathognomonic for this disease and excludes other diagnoses</w:t>
+        <w:t xml:space="preserve">It is pathognomonic for this disease and reliably excludes all other diagnoses</w:t>
       </w:r>
     </w:p>
     <w:p>
@@ -570,7 +570,7 @@
           <w:b w:val="false"/>
           <w:bCs w:val="false"/>
         </w:rPr>
-        <w:t xml:space="preserve">It typically causes significant visual loss requiring corneal transplantation</w:t>
+        <w:t xml:space="preserve">It typically causes progressive visual loss that requires corneal transplantation</w:t>
       </w:r>
     </w:p>
     <w:p>
@@ -590,7 +590,7 @@
           <w:b/>
           <w:bCs/>
         </w:rPr>
-        <w:t xml:space="preserve">It is also seen with chronic amiodarone, chloroquine, and other cationic amphiphilic drug use</w:t>
+        <w:t xml:space="preserve">It also occurs with chronic amiodarone, chloroquine, or hydroxychloroquine therapy</w:t>
       </w:r>
       <w:r>
         <w:rPr>
@@ -618,7 +618,7 @@
           <w:b w:val="false"/>
           <w:bCs w:val="false"/>
         </w:rPr>
-        <w:t xml:space="preserve">It is usually asymmetric, affecting only one eye in most patients</w:t>
+        <w:t xml:space="preserve">It is usually markedly asymmetric, affecting only one eye in the majority of patients</w:t>
       </w:r>
     </w:p>
     <w:p>
@@ -662,7 +662,7 @@
           <w:b/>
           <w:bCs/>
         </w:rPr>
-        <w:t xml:space="preserve">Decreased pinprick and temperature sensation distally, with preserved vibration and proprioception</w:t>
+        <w:t xml:space="preserve">Reduced pinprick and temperature sensation distally, with preserved vibration sense</w:t>
       </w:r>
       <w:r>
         <w:rPr>
@@ -690,7 +690,7 @@
           <w:b w:val="false"/>
           <w:bCs w:val="false"/>
         </w:rPr>
-        <w:t xml:space="preserve">Decreased vibration and proprioception in the feet, with preserved pinprick and temperature</w:t>
+        <w:t xml:space="preserve">Reduced vibration and proprioception in the feet, with preserved pinprick and temperature</w:t>
       </w:r>
     </w:p>
     <w:p>
@@ -710,7 +710,7 @@
           <w:b w:val="false"/>
           <w:bCs w:val="false"/>
         </w:rPr>
-        <w:t xml:space="preserve">A patchy, asymmetric distribution consistent with mononeuritis multiplex</w:t>
+        <w:t xml:space="preserve">A patchy, asymmetric sensory deficit consistent with a mononeuritis multiplex pattern</w:t>
       </w:r>
     </w:p>
     <w:p>
@@ -730,7 +730,7 @@
           <w:b w:val="false"/>
           <w:bCs w:val="false"/>
         </w:rPr>
-        <w:t xml:space="preserve">A "stocking-glove" loss of all sensory modalities with absent ankle reflexes</w:t>
+        <w:t xml:space="preserve">A symmetric 'stocking-glove' loss of all sensory modalities with absent ankle reflexes</w:t>
       </w:r>
     </w:p>
     <w:p>
@@ -886,7 +886,7 @@
           <w:b/>
           <w:bCs/>
         </w:rPr>
-        <w:t xml:space="preserve">GLA gene sequencing is required, because enzyme activity is unreliable in heterozygous females</w:t>
+        <w:t xml:space="preserve">Send GLA gene sequencing, because enzyme activity is unreliable in carrier females</w:t>
       </w:r>
       <w:r>
         <w:rPr>
@@ -914,7 +914,7 @@
           <w:b w:val="false"/>
           <w:bCs w:val="false"/>
         </w:rPr>
-        <w:t xml:space="preserve">She is definitively unaffected and does not require further evaluation</w:t>
+        <w:t xml:space="preserve">She is definitively unaffected and requires no further evaluation or genetic testing</w:t>
       </w:r>
     </w:p>
     <w:p>
@@ -934,7 +934,7 @@
           <w:b w:val="false"/>
           <w:bCs w:val="false"/>
         </w:rPr>
-        <w:t xml:space="preserve">She has the disease confirmed; her enzyme activity is normal due to compensatory pathways</w:t>
+        <w:t xml:space="preserve">Her diagnosis is confirmed; the normal enzyme activity reflects compensatory pathways</w:t>
       </w:r>
     </w:p>
     <w:p>
@@ -954,7 +954,7 @@
           <w:b w:val="false"/>
           <w:bCs w:val="false"/>
         </w:rPr>
-        <w:t xml:space="preserve">She has a 50% chance of being a carrier and should defer testing until she becomes symptomatic</w:t>
+        <w:t xml:space="preserve">She has a 50% chance of carrying it and should defer testing until she is symptomatic</w:t>
       </w:r>
     </w:p>
     <w:p>
@@ -1110,7 +1110,7 @@
           <w:b w:val="false"/>
           <w:bCs w:val="false"/>
         </w:rPr>
-        <w:t xml:space="preserve">Is a substrate reduction therapy that inhibits glucosylceramide synthase</w:t>
+        <w:t xml:space="preserve">Is an oral substrate reduction therapy that inhibits the enzyme glucosylceramide synthase</w:t>
       </w:r>
     </w:p>
     <w:p>
@@ -1130,7 +1130,7 @@
           <w:b/>
           <w:bCs/>
         </w:rPr>
-        <w:t xml:space="preserve">Is a pharmacologic chaperone effective only in patients with specific "amenable" GLA mutations</w:t>
+        <w:t xml:space="preserve">Is a pharmacologic chaperone that works only in patients with 'amenable' GLA mutations</w:t>
       </w:r>
       <w:r>
         <w:rPr>
@@ -1158,7 +1158,7 @@
           <w:b w:val="false"/>
           <w:bCs w:val="false"/>
         </w:rPr>
-        <w:t xml:space="preserve">Is administered intravenously every two weeks alongside enzyme replacement therapy</w:t>
+        <w:t xml:space="preserve">Is given intravenously every two weeks alongside standard enzyme replacement therapy</w:t>
       </w:r>
     </w:p>
     <w:p>
@@ -1178,7 +1178,7 @@
           <w:b w:val="false"/>
           <w:bCs w:val="false"/>
         </w:rPr>
-        <w:t xml:space="preserve">Is curative when combined with hematopoietic stem cell transplantation</w:t>
+        <w:t xml:space="preserve">Is curative when it is combined with hematopoietic stem-cell transplantation early on</w:t>
       </w:r>
     </w:p>
     <w:p>
@@ -1222,7 +1222,7 @@
           <w:b w:val="false"/>
           <w:bCs w:val="false"/>
         </w:rPr>
-        <w:t xml:space="preserve">A high-dose loop diuretic such as furosemide to control fluid overload</w:t>
+        <w:t xml:space="preserve">A high-dose loop diuretic such as furosemide to control chronic fluid overload</w:t>
       </w:r>
     </w:p>
     <w:p>
@@ -1242,7 +1242,7 @@
           <w:b w:val="false"/>
           <w:bCs w:val="false"/>
         </w:rPr>
-        <w:t xml:space="preserve">Chronic empiric oral corticosteroids to slow glomerular injury</w:t>
+        <w:t xml:space="preserve">Chronic empiric oral corticosteroids to slow progressive glomerular injury over time</w:t>
       </w:r>
     </w:p>
     <w:p>
@@ -1262,7 +1262,7 @@
           <w:b/>
           <w:bCs/>
         </w:rPr>
-        <w:t xml:space="preserve">An ACE inhibitor or angiotensin receptor blocker, titrated to reduce proteinuria</w:t>
+        <w:t xml:space="preserve">An ACE inhibitor or angiotensin receptor blocker titrated to reduce proteinuria</w:t>
       </w:r>
       <w:r>
         <w:rPr>
@@ -1290,7 +1290,7 @@
           <w:b w:val="false"/>
           <w:bCs w:val="false"/>
         </w:rPr>
-        <w:t xml:space="preserve">A calcineurin inhibitor such as tacrolimus to suppress glomerular inflammation</w:t>
+        <w:t xml:space="preserve">A calcineurin inhibitor such as tacrolimus to suppress ongoing glomerular inflammation</w:t>
       </w:r>
     </w:p>
     <w:p>
@@ -1474,7 +1474,7 @@
           <w:b w:val="false"/>
           <w:bCs w:val="false"/>
         </w:rPr>
-        <w:t xml:space="preserve">Immune-mediated demyelination</w:t>
+        <w:t xml:space="preserve">Immune-mediated demyelination of the peripheral sensory nerves</w:t>
       </w:r>
     </w:p>
     <w:p>
@@ -1494,7 +1494,7 @@
           <w:b w:val="false"/>
           <w:bCs w:val="false"/>
         </w:rPr>
-        <w:t xml:space="preserve">Compression neuropathy from tissue edema</w:t>
+        <w:t xml:space="preserve">Entrapment and compression neuropathy from soft-tissue edema</w:t>
       </w:r>
     </w:p>
     <w:p>
@@ -1514,7 +1514,7 @@
           <w:b w:val="false"/>
           <w:bCs w:val="false"/>
         </w:rPr>
-        <w:t xml:space="preserve">Autoimmune vasculitis of peripheral nerves</w:t>
+        <w:t xml:space="preserve">Autoimmune small-vessel vasculitis affecting the peripheral nerves</w:t>
       </w:r>
     </w:p>
     <w:p>
@@ -1558,7 +1558,7 @@
           <w:b w:val="false"/>
           <w:bCs w:val="false"/>
         </w:rPr>
-        <w:t xml:space="preserve">Chronic systemic hypertension alone</w:t>
+        <w:t xml:space="preserve">Chronic, poorly controlled systemic arterial hypertension</w:t>
       </w:r>
     </w:p>
     <w:p>
@@ -1578,7 +1578,7 @@
           <w:b w:val="false"/>
           <w:bCs w:val="false"/>
         </w:rPr>
-        <w:t xml:space="preserve">Coronary vasospasm causing fibrosis</w:t>
+        <w:t xml:space="preserve">Coronary vasospasm causing recurrent ischemia and fibrosis</w:t>
       </w:r>
     </w:p>
     <w:p>
@@ -1598,7 +1598,7 @@
           <w:b w:val="false"/>
           <w:bCs w:val="false"/>
         </w:rPr>
-        <w:t xml:space="preserve">Recurrent myocarditis</w:t>
+        <w:t xml:space="preserve">Recurrent viral myocarditis with inflammatory remodeling</w:t>
       </w:r>
     </w:p>
     <w:p>
@@ -1618,7 +1618,7 @@
           <w:b/>
           <w:bCs/>
         </w:rPr>
-        <w:t xml:space="preserve">Glycosphingolipid accumulation within cardiomyocytes</w:t>
+        <w:t xml:space="preserve">Glycosphingolipid accumulation within the cardiomyocytes</w:t>
       </w:r>
       <w:r>
         <w:rPr>
@@ -1782,7 +1782,7 @@
           <w:b w:val="false"/>
           <w:bCs w:val="false"/>
         </w:rPr>
-        <w:t xml:space="preserve">Reverse all accumulated organ damage</w:t>
+        <w:t xml:space="preserve">Reverse all of the organ damage that has already accumulated</w:t>
       </w:r>
     </w:p>
     <w:p>
@@ -1802,7 +1802,7 @@
           <w:b w:val="false"/>
           <w:bCs w:val="false"/>
         </w:rPr>
-        <w:t xml:space="preserve">Eliminate inheritance risk</w:t>
+        <w:t xml:space="preserve">Eliminate the risk of transmitting the disease to offspring</w:t>
       </w:r>
     </w:p>
     <w:p>
@@ -1822,7 +1822,7 @@
           <w:b/>
           <w:bCs/>
         </w:rPr>
-        <w:t xml:space="preserve">Prevent irreversible organ fibrosis and dysfunction</w:t>
+        <w:t xml:space="preserve">Prevent irreversible organ fibrosis and loss of function</w:t>
       </w:r>
       <w:r>
         <w:rPr>
@@ -1850,7 +1850,7 @@
           <w:b w:val="false"/>
           <w:bCs w:val="false"/>
         </w:rPr>
-        <w:t xml:space="preserve">Normalize lifespan</w:t>
+        <w:t xml:space="preserve">Restore a normal life expectancy in essentially all patients</w:t>
       </w:r>
     </w:p>
     <w:p>
@@ -1894,7 +1894,7 @@
           <w:b/>
           <w:bCs/>
         </w:rPr>
-        <w:t xml:space="preserve">Young man with unexplained CKD, neuropathic pain, and family history of renal disease</w:t>
+        <w:t xml:space="preserve">Young man with proteinuric CKD, lifelong burning pain in the hands and feet, and a maternal uncle on dialysis</w:t>
       </w:r>
       <w:r>
         <w:rPr>
@@ -1922,7 +1922,7 @@
           <w:b w:val="false"/>
           <w:bCs w:val="false"/>
         </w:rPr>
-        <w:t xml:space="preserve">Elderly patient with diabetic nephropathy</w:t>
+        <w:t xml:space="preserve">Young woman with proteinuria, a photosensitive facial rash, and inflammatory polyarthralgia of the hands</w:t>
       </w:r>
     </w:p>
     <w:p>
@@ -1942,7 +1942,7 @@
           <w:b w:val="false"/>
           <w:bCs w:val="false"/>
         </w:rPr>
-        <w:t xml:space="preserve">Middle-aged smoker with hematuria</w:t>
+        <w:t xml:space="preserve">Young man with persistent hematuria, progressive sensorineural hearing loss, and a family history of kidney failure</w:t>
       </w:r>
     </w:p>
     <w:p>
@@ -1962,7 +1962,7 @@
           <w:b w:val="false"/>
           <w:bCs w:val="false"/>
         </w:rPr>
-        <w:t xml:space="preserve">Woman with isolated nephrolithiasis</w:t>
+        <w:t xml:space="preserve">Young adult with episodic flank pain, gross hematuria, and numerous bilateral renal cysts seen on imaging</w:t>
       </w:r>
     </w:p>
     <w:p>
@@ -1986,7 +1986,7 @@
         <w:spacing w:after="80"/>
       </w:pPr>
       <w:r>
-        <w:t xml:space="preserve">Beyond left ventricular hypertrophy, which cardiac complication most commonly leads to pacemaker or ICD placement in patients with Fabry disease?</w:t>
+        <w:t xml:space="preserve">Beyond left ventricular hypertrophy, which of the following is another characteristic cardiac manifestation of Fabry disease?</w:t>
       </w:r>
     </w:p>
     <w:p>
@@ -2006,7 +2006,7 @@
           <w:b w:val="false"/>
           <w:bCs w:val="false"/>
         </w:rPr>
-        <w:t xml:space="preserve">Recurrent supraventricular tachycardia</w:t>
+        <w:t xml:space="preserve">Recurrent paroxysmal supraventricular tachycardia arising from a congenital accessory pathway</w:t>
       </w:r>
     </w:p>
     <w:p>
@@ -2026,7 +2026,7 @@
           <w:b/>
           <w:bCs/>
         </w:rPr>
-        <w:t xml:space="preserve">Progressive conduction-system disease (sinus node dysfunction and AV block)</w:t>
+        <w:t xml:space="preserve">Progressive conduction disease and arrhythmias, such as AV block and atrial fibrillation</w:t>
       </w:r>
       <w:r>
         <w:rPr>
@@ -2054,7 +2054,7 @@
           <w:b w:val="false"/>
           <w:bCs w:val="false"/>
         </w:rPr>
-        <w:t xml:space="preserve">Congenital long-QT syndrome with torsades de pointes</w:t>
+        <w:t xml:space="preserve">Congenital long-QT syndrome that predisposes the patient to torsades de pointes</w:t>
       </w:r>
     </w:p>
     <w:p>
@@ -2074,7 +2074,7 @@
           <w:b w:val="false"/>
           <w:bCs w:val="false"/>
         </w:rPr>
-        <w:t xml:space="preserve">Right heart failure from pulmonary arterial hypertension</w:t>
+        <w:t xml:space="preserve">Pulmonary arterial hypertension that leads to progressive right heart failure</w:t>
       </w:r>
     </w:p>
     <w:p>
@@ -2118,7 +2118,7 @@
           <w:b w:val="false"/>
           <w:bCs w:val="false"/>
         </w:rPr>
-        <w:t xml:space="preserve">Plasma globotriaosylceramide (Gb3)</w:t>
+        <w:t xml:space="preserve">Plasma globotriaosylceramide (Gb3) concentration</w:t>
       </w:r>
     </w:p>
     <w:p>
@@ -2166,7 +2166,7 @@
           <w:b w:val="false"/>
           <w:bCs w:val="false"/>
         </w:rPr>
-        <w:t xml:space="preserve">Leukocyte alpha-galactosidase A activity</w:t>
+        <w:t xml:space="preserve">Leukocyte alpha-galactosidase A enzyme activity</w:t>
       </w:r>
     </w:p>
     <w:p>
@@ -2186,7 +2186,7 @@
           <w:b w:val="false"/>
           <w:bCs w:val="false"/>
         </w:rPr>
-        <w:t xml:space="preserve">24-hour urine protein-to-creatinine ratio</w:t>
+        <w:t xml:space="preserve">A 24-hour urine protein-to-creatinine ratio</w:t>
       </w:r>
     </w:p>
     <w:p>
@@ -2230,7 +2230,7 @@
           <w:b w:val="false"/>
           <w:bCs w:val="false"/>
         </w:rPr>
-        <w:t xml:space="preserve">Cardioembolic stroke as the predominant mechanism</w:t>
+        <w:t xml:space="preserve">Large-artery cardioembolic stroke as the single predominant mechanism</w:t>
       </w:r>
     </w:p>
     <w:p>
@@ -2250,7 +2250,7 @@
           <w:b w:val="false"/>
           <w:bCs w:val="false"/>
         </w:rPr>
-        <w:t xml:space="preserve">Lobar intracerebral hemorrhage from cerebral amyloid angiopathy</w:t>
+        <w:t xml:space="preserve">Lobar intracerebral hemorrhage caused by underlying cerebral amyloid angiopathy</w:t>
       </w:r>
     </w:p>
     <w:p>
@@ -2270,7 +2270,7 @@
           <w:b/>
           <w:bCs/>
         </w:rPr>
-        <w:t xml:space="preserve">Small-vessel ischemic stroke with a predilection for the posterior (vertebrobasilar) circulation</w:t>
+        <w:t xml:space="preserve">Small-vessel ischemic stroke with a predilection for the posterior circulation</w:t>
       </w:r>
       <w:r>
         <w:rPr>
@@ -2298,7 +2298,7 @@
           <w:b w:val="false"/>
           <w:bCs w:val="false"/>
         </w:rPr>
-        <w:t xml:space="preserve">Subarachnoid hemorrhage from ruptured saccular aneurysms</w:t>
+        <w:t xml:space="preserve">Subarachnoid hemorrhage from the rupture of a berry (saccular) aneurysm in the circle of Willis</w:t>
       </w:r>
     </w:p>
     <w:p>
@@ -2342,7 +2342,7 @@
           <w:b w:val="false"/>
           <w:bCs w:val="false"/>
         </w:rPr>
-        <w:t xml:space="preserve">Anticholinergic side effect of one of his medications</w:t>
+        <w:t xml:space="preserve">An anticholinergic adverse effect of one of his current medications</w:t>
       </w:r>
     </w:p>
     <w:p>
@@ -2362,7 +2362,7 @@
           <w:b w:val="false"/>
           <w:bCs w:val="false"/>
         </w:rPr>
-        <w:t xml:space="preserve">Hypothalamic thermoregulatory dysfunction</w:t>
+        <w:t xml:space="preserve">Primary hypothalamic thermoregulatory dysfunction of central origin</w:t>
       </w:r>
     </w:p>
     <w:p>
@@ -2382,7 +2382,7 @@
           <w:b w:val="false"/>
           <w:bCs w:val="false"/>
         </w:rPr>
-        <w:t xml:space="preserve">Deconditioning and reduced cardiac output from his cardiomyopathy</w:t>
+        <w:t xml:space="preserve">Physical deconditioning and reduced cardiac output from his cardiomyopathy</w:t>
       </w:r>
     </w:p>
     <w:p>
@@ -2402,7 +2402,7 @@
           <w:b/>
           <w:bCs/>
         </w:rPr>
-        <w:t xml:space="preserve">Fabry-related small-fiber and autonomic dysfunction impairing sweating (hypohidrosis)</w:t>
+        <w:t xml:space="preserve">Fabry-related small-fiber and autonomic dysfunction that impairs sweating</w:t>
       </w:r>
       <w:r>
         <w:rPr>
@@ -2454,7 +2454,7 @@
           <w:b/>
           <w:bCs/>
         </w:rPr>
-        <w:t xml:space="preserve">The transplanted kidney is generally spared, but heart and brain disease continue to progress without disease-specific therapy</w:t>
+        <w:t xml:space="preserve">The graft is largely spared, but cardiac and cerebrovascular disease keep progressing</w:t>
       </w:r>
       <w:r>
         <w:rPr>
@@ -2482,7 +2482,7 @@
           <w:b w:val="false"/>
           <w:bCs w:val="false"/>
         </w:rPr>
-        <w:t xml:space="preserve">The transplanted kidney rapidly develops Fabry nephropathy and fails within a year</w:t>
+        <w:t xml:space="preserve">The graft re-accumulates glycosphingolipid and predictably fails within the first year</w:t>
       </w:r>
     </w:p>
     <w:p>
@@ -2502,7 +2502,7 @@
           <w:b w:val="false"/>
           <w:bCs w:val="false"/>
         </w:rPr>
-        <w:t xml:space="preserve">Transplantation cures Fabry disease by restoring systemic enzyme levels</w:t>
+        <w:t xml:space="preserve">Transplantation corrects the enzyme deficiency systemically and halts disease elsewhere</w:t>
       </w:r>
     </w:p>
     <w:p>
@@ -2522,7 +2522,7 @@
           <w:b w:val="false"/>
           <w:bCs w:val="false"/>
         </w:rPr>
-        <w:t xml:space="preserve">Transplantation is contraindicated in Fabry disease</w:t>
+        <w:t xml:space="preserve">A living related-donor graft is strongly preferred because relatives resist recurrence</w:t>
       </w:r>
     </w:p>
     <w:p>

</xml_diff>